<commit_message>
Actualiza informe final de Word con captura de la vista web final
</commit_message>
<xml_diff>
--- a/CURSOS/informe/INFORME FINAL DE MODELAMIENTO DE SOFTWARE_Tecnico_Sistema_Registro_Estudiantes_CORREA_DIONICIO.docx
+++ b/CURSOS/informe/INFORME FINAL DE MODELAMIENTO DE SOFTWARE_Tecnico_Sistema_Registro_Estudiantes_CORREA_DIONICIO.docx
@@ -2687,15 +2687,7 @@
         <w:spacing w:after="160"/>
       </w:pPr>
       <w:r>
-        <w:t xml:space="preserve">Durante el desarrollo se aplicó la metodología de modelamiento de software, iniciando con el análisis de requerimientos, la elaboración de diagramas UML, la implementación del sistema utilizando tecnologías web (HTML, CSS y JavaScript) y el uso de Git y GitHub como herramientas para el control de versiones del proyecto. Finalmente, se obtuvo una aplicación funcional que almacena la información utilizando </w:t>
-      </w:r>
-      <w:proofErr w:type="spellStart"/>
-      <w:r>
-        <w:t>LocalStorage</w:t>
-      </w:r>
-      <w:proofErr w:type="spellEnd"/>
-      <w:r>
-        <w:t>, permitiendo conservar los registros aun después de cerrar el navegador.</w:t>
+        <w:t>Durante el desarrollo se aplicó la metodología de modelamiento de software, iniciando con el análisis de requerimientos, la elaboración de diagramas UML, la implementación del sistema utilizando tecnologías web (HTML, CSS y JavaScript) y el uso de Git y GitHub como herramientas para el control de versiones del proyecto. Finalmente, se obtuvo una aplicación funcional que almacena la información utilizando LocalStorage, permitiendo conservar los registros aun después de cerrar el navegador.</w:t>
       </w:r>
     </w:p>
     <w:p>
@@ -3872,13 +3864,8 @@
           </w:tcPr>
           <w:p>
             <w:r>
-              <w:t xml:space="preserve">Uso de </w:t>
-            </w:r>
-            <w:proofErr w:type="spellStart"/>
-            <w:r>
-              <w:t>LocalStorage</w:t>
-            </w:r>
-            <w:proofErr w:type="spellEnd"/>
+              <w:t>Uso de LocalStorage</w:t>
+            </w:r>
           </w:p>
         </w:tc>
       </w:tr>
@@ -3952,15 +3939,7 @@
         <w:t xml:space="preserve">script.js — </w:t>
       </w:r>
       <w:r>
-        <w:t xml:space="preserve">Se implementó toda la lógica del sistema, incluyendo el registro, búsqueda, edición, eliminación y almacenamiento de estudiantes mediante </w:t>
-      </w:r>
-      <w:proofErr w:type="spellStart"/>
-      <w:r>
-        <w:t>LocalStorage</w:t>
-      </w:r>
-      <w:proofErr w:type="spellEnd"/>
-      <w:r>
-        <w:t>.</w:t>
+        <w:t>Se implementó toda la lógica del sistema, incluyendo el registro, búsqueda, edición, eliminación y almacenamiento de estudiantes mediante LocalStorage.</w:t>
       </w:r>
     </w:p>
     <w:p>
@@ -4243,15 +4222,7 @@
         <w:spacing w:after="80"/>
       </w:pPr>
       <w:r>
-        <w:t xml:space="preserve">Flujo principal (datos completos): si la validación es exitosa, el sistema guarda los datos del estudiante en la memoria temporal, actualiza la tabla de la interfaz gráfica para que el nuevo registro sea visible y finalmente guarda la información en el </w:t>
-      </w:r>
-      <w:proofErr w:type="spellStart"/>
-      <w:r>
-        <w:t>LocalStorage</w:t>
-      </w:r>
-      <w:proofErr w:type="spellEnd"/>
-      <w:r>
-        <w:t xml:space="preserve"> para asegurar la persistencia de los datos.</w:t>
+        <w:t>Flujo principal (datos completos): si la validación es exitosa, el sistema guarda los datos del estudiante en la memoria temporal, actualiza la tabla de la interfaz gráfica para que el nuevo registro sea visible y finalmente guarda la información en el LocalStorage para asegurar la persistencia de los datos.</w:t>
       </w:r>
     </w:p>
     <w:p>
@@ -4384,15 +4355,7 @@
       </w:pPr>
       <w:r>
         <w:lastRenderedPageBreak/>
-        <w:t>El controlador JavaScript procesa la solicitud y envía la instrucción de "Guardar estudiante" a la base de datos del navegador (</w:t>
-      </w:r>
-      <w:proofErr w:type="spellStart"/>
-      <w:r>
-        <w:t>LocalStorage</w:t>
-      </w:r>
-      <w:proofErr w:type="spellEnd"/>
-      <w:r>
-        <w:t>).</w:t>
+        <w:t>El controlador JavaScript procesa la solicitud y envía la instrucción de "Guardar estudiante" a la base de datos del navegador (LocalStorage).</w:t>
       </w:r>
     </w:p>
     <w:p>
@@ -4405,15 +4368,7 @@
         <w:spacing w:after="80"/>
       </w:pPr>
       <w:r>
-        <w:t xml:space="preserve">Una vez que la información se almacena correctamente, el </w:t>
-      </w:r>
-      <w:proofErr w:type="spellStart"/>
-      <w:r>
-        <w:t>LocalStorage</w:t>
-      </w:r>
-      <w:proofErr w:type="spellEnd"/>
-      <w:r>
-        <w:t xml:space="preserve"> emite una confirmación de guardado de vuelta al controlador JavaScript.</w:t>
+        <w:t>Una vez que la información se almacena correctamente, el LocalStorage emite una confirmación de guardado de vuelta al controlador JavaScript.</w:t>
       </w:r>
     </w:p>
     <w:p>
@@ -4434,15 +4389,7 @@
         <w:spacing w:after="160"/>
       </w:pPr>
       <w:r>
-        <w:t>En conclusión, este diagrama demuestra cómo la arquitectura del sistema separa claramente la vista (formulario), la lógica del negocio (JavaScript) y la persistencia de datos (</w:t>
-      </w:r>
-      <w:proofErr w:type="spellStart"/>
-      <w:r>
-        <w:t>LocalStorage</w:t>
-      </w:r>
-      <w:proofErr w:type="spellEnd"/>
-      <w:r>
-        <w:t>), logrando un flujo de registro eficiente y en tiempo real.</w:t>
+        <w:t>En conclusión, este diagrama demuestra cómo la arquitectura del sistema separa claramente la vista (formulario), la lógica del negocio (JavaScript) y la persistencia de datos (LocalStorage), logrando un flujo de registro eficiente y en tiempo real.</w:t>
       </w:r>
     </w:p>
     <w:p>
@@ -4526,15 +4473,7 @@
         <w:spacing w:after="160"/>
       </w:pPr>
       <w:r>
-        <w:t xml:space="preserve">El diagrama de clases representa la estructura lógica de la información manejada por el sistema. Aunque la aplicación emplea </w:t>
-      </w:r>
-      <w:proofErr w:type="spellStart"/>
-      <w:r>
-        <w:t>LocalStorage</w:t>
-      </w:r>
-      <w:proofErr w:type="spellEnd"/>
-      <w:r>
-        <w:t xml:space="preserve"> para conservar los datos en el navegador, se ha modelado una única entidad principal denominada ESTUDIANTE, con los atributos id, nombre, apellido, edad y carrera, la cual se detalla en la sección 9.</w:t>
+        <w:t>El diagrama de clases representa la estructura lógica de la información manejada por el sistema. Aunque la aplicación emplea LocalStorage para conservar los datos en el navegador, se ha modelado una única entidad principal denominada ESTUDIANTE, con los atributos id, nombre, apellido, edad y carrera, la cual se detalla en la sección 9.</w:t>
       </w:r>
     </w:p>
     <w:p>
@@ -4619,15 +4558,7 @@
         <w:spacing w:after="160"/>
       </w:pPr>
       <w:r>
-        <w:t xml:space="preserve">El presente modelo de base de datos define la estructura lógica utilizada para el almacenamiento de la información en el sistema. Aunque la aplicación emplea </w:t>
-      </w:r>
-      <w:proofErr w:type="spellStart"/>
-      <w:r>
-        <w:t>LocalStorage</w:t>
-      </w:r>
-      <w:proofErr w:type="spellEnd"/>
-      <w:r>
-        <w:t xml:space="preserve"> para conservar los datos de forma local en el navegador, se diseñó una entidad lógica principal denominada ESTUDIANTE para representar la persistencia de los datos, estructurada por los siguientes campos:</w:t>
+        <w:t>El presente modelo de base de datos define la estructura lógica utilizada para el almacenamiento de la información en el sistema. Aunque la aplicación emplea LocalStorage para conservar los datos de forma local en el navegador, se diseñó una entidad lógica principal denominada ESTUDIANTE para representar la persistencia de los datos, estructurada por los siguientes campos:</w:t>
       </w:r>
     </w:p>
     <w:p>
@@ -4847,13 +4778,8 @@
             <w:vAlign w:val="center"/>
           </w:tcPr>
           <w:p>
-            <w:proofErr w:type="gramStart"/>
-            <w:r>
-              <w:t>VARCHAR(</w:t>
-            </w:r>
-            <w:proofErr w:type="gramEnd"/>
-            <w:r>
-              <w:t>100)</w:t>
+            <w:r>
+              <w:t>VARCHAR(100)</w:t>
             </w:r>
           </w:p>
         </w:tc>
@@ -4888,13 +4814,8 @@
             <w:vAlign w:val="center"/>
           </w:tcPr>
           <w:p>
-            <w:proofErr w:type="gramStart"/>
-            <w:r>
-              <w:t>VARCHAR(</w:t>
-            </w:r>
-            <w:proofErr w:type="gramEnd"/>
-            <w:r>
-              <w:t>100)</w:t>
+            <w:r>
+              <w:t>VARCHAR(100)</w:t>
             </w:r>
           </w:p>
         </w:tc>
@@ -4965,13 +4886,8 @@
             <w:vAlign w:val="center"/>
           </w:tcPr>
           <w:p>
-            <w:proofErr w:type="gramStart"/>
-            <w:r>
-              <w:t>VARCHAR(</w:t>
-            </w:r>
-            <w:proofErr w:type="gramEnd"/>
-            <w:r>
-              <w:t>100)</w:t>
+            <w:r>
+              <w:t>VARCHAR(100)</w:t>
             </w:r>
           </w:p>
         </w:tc>
@@ -5078,15 +4994,7 @@
         <w:spacing w:after="80"/>
       </w:pPr>
       <w:r>
-        <w:t xml:space="preserve">Conservar los datos almacenados en </w:t>
-      </w:r>
-      <w:proofErr w:type="spellStart"/>
-      <w:r>
-        <w:t>LocalStorage</w:t>
-      </w:r>
-      <w:proofErr w:type="spellEnd"/>
-      <w:r>
-        <w:t xml:space="preserve"> incluso después de recargar la página.</w:t>
+        <w:t>Conservar los datos almacenados en LocalStorage incluso después de recargar la página.</w:t>
       </w:r>
     </w:p>
     <w:p>
@@ -5123,15 +5031,7 @@
     </w:p>
     <w:p>
       <w:r>
-        <w:t xml:space="preserve">El control de versiones del proyecto se gestionó utilizando Git en el equipo local y GitHub como repositorio remoto. Esta práctica permitió llevar un registro ordenado de los avances, mantener respaldado el código fuente y dejar evidencia verificable del proceso de desarrollo. A </w:t>
-      </w:r>
-      <w:proofErr w:type="gramStart"/>
-      <w:r>
-        <w:t>continuación</w:t>
-      </w:r>
-      <w:proofErr w:type="gramEnd"/>
-      <w:r>
-        <w:t xml:space="preserve"> se describe cada etapa de este proceso junto con la evidencia correspondiente.</w:t>
+        <w:t>El control de versiones del proyecto se gestionó utilizando Git en el equipo local y GitHub como repositorio remoto. Esta práctica permitió llevar un registro ordenado de los avances, mantener respaldado el código fuente y dejar evidencia verificable del proceso de desarrollo. A continuación se describe cada etapa de este proceso junto con la evidencia correspondiente.</w:t>
       </w:r>
     </w:p>
     <w:p/>
@@ -5143,15 +5043,7 @@
         </w:numPr>
       </w:pPr>
       <w:r>
-        <w:t>Se creó el repositorio remoto en GitHub, definiendo el nombre del proyecto (IESTP-</w:t>
-      </w:r>
-      <w:proofErr w:type="spellStart"/>
-      <w:r>
-        <w:t>Sistema_de_Registro_Estudiantes</w:t>
-      </w:r>
-      <w:proofErr w:type="spellEnd"/>
-      <w:r>
-        <w:t>) y agregando un archivo README.</w:t>
+        <w:t>Se creó el repositorio remoto en GitHub, definiendo el nombre del proyecto (IESTP-Sistema_de_Registro_Estudiantes) y agregando un archivo README.</w:t>
       </w:r>
     </w:p>
     <w:p>
@@ -5162,15 +5054,7 @@
         </w:numPr>
       </w:pPr>
       <w:r>
-        <w:t xml:space="preserve">Se autorizó Git </w:t>
-      </w:r>
-      <w:proofErr w:type="spellStart"/>
-      <w:r>
-        <w:t>Credential</w:t>
-      </w:r>
-      <w:proofErr w:type="spellEnd"/>
-      <w:r>
-        <w:t xml:space="preserve"> Manager para vincular el equipo local con la cuenta de GitHub, completando la autenticación de forma segura.</w:t>
+        <w:t>Se autorizó Git Credential Manager para vincular el equipo local con la cuenta de GitHub, completando la autenticación de forma segura.</w:t>
       </w:r>
     </w:p>
     <w:p>
@@ -5181,15 +5065,7 @@
         </w:numPr>
       </w:pPr>
       <w:r>
-        <w:t xml:space="preserve">Se registraron los avances del proyecto mediante </w:t>
-      </w:r>
-      <w:proofErr w:type="spellStart"/>
-      <w:r>
-        <w:t>commits</w:t>
-      </w:r>
-      <w:proofErr w:type="spellEnd"/>
-      <w:r>
-        <w:t xml:space="preserve"> descriptivos desde la terminal (Git Bash).</w:t>
+        <w:t>Se registraron los avances del proyecto mediante commits descriptivos desde la terminal (Git Bash).</w:t>
       </w:r>
     </w:p>
     <w:p>
@@ -5200,15 +5076,7 @@
         </w:numPr>
       </w:pPr>
       <w:r>
-        <w:t>Se trabajó sobre la rama principal (</w:t>
-      </w:r>
-      <w:proofErr w:type="spellStart"/>
-      <w:r>
-        <w:t>main</w:t>
-      </w:r>
-      <w:proofErr w:type="spellEnd"/>
-      <w:r>
-        <w:t>), manteniendo organizados los archivos del proyecto.</w:t>
+        <w:t>Se trabajó sobre la rama principal (main), manteniendo organizados los archivos del proyecto.</w:t>
       </w:r>
     </w:p>
     <w:p>
@@ -5294,39 +5162,7 @@
         <w:t>La Figura 5</w:t>
       </w:r>
       <w:r>
-        <w:t xml:space="preserve"> muestra el formulario de creación de un nuevo repositorio en GitHub. En el campo "Owner" se seleccionó la cuenta del autor (</w:t>
-      </w:r>
-      <w:proofErr w:type="spellStart"/>
-      <w:r>
-        <w:t>Erichjcb</w:t>
-      </w:r>
-      <w:proofErr w:type="spellEnd"/>
-      <w:r>
-        <w:t>) y en "</w:t>
-      </w:r>
-      <w:proofErr w:type="spellStart"/>
-      <w:r>
-        <w:t>Repository</w:t>
-      </w:r>
-      <w:proofErr w:type="spellEnd"/>
-      <w:r>
-        <w:t xml:space="preserve"> </w:t>
-      </w:r>
-      <w:proofErr w:type="spellStart"/>
-      <w:r>
-        <w:t>name</w:t>
-      </w:r>
-      <w:proofErr w:type="spellEnd"/>
-      <w:r>
-        <w:t>" se asignó el nombre IESTP-</w:t>
-      </w:r>
-      <w:proofErr w:type="spellStart"/>
-      <w:r>
-        <w:t>Sistema_de_Registro_Estudiantes</w:t>
-      </w:r>
-      <w:proofErr w:type="spellEnd"/>
-      <w:r>
-        <w:t>, siguiendo una nomenclatura clara que identifica tanto la institución como el propósito del proyecto. En la sección de configuración se definió la visibilidad del repositorio como "Public", de modo que el proyecto quede accesible para su revisión y sustentación. Este paso marca el punto de partida de la gestión del proyecto en la nube, ya que a partir de aquí GitHub actúa como el repositorio remoto donde se almacenará todo el historial de cambios del código fuente.</w:t>
+        <w:t xml:space="preserve"> muestra el formulario de creación de un nuevo repositorio en GitHub. En el campo "Owner" se seleccionó la cuenta del autor (Erichjcb) y en "Repository name" se asignó el nombre IESTP-Sistema_de_Registro_Estudiantes, siguiendo una nomenclatura clara que identifica tanto la institución como el propósito del proyecto. En la sección de configuración se definió la visibilidad del repositorio como "Public", de modo que el proyecto quede accesible para su revisión y sustentación. Este paso marca el punto de partida de la gestión del proyecto en la nube, ya que a partir de aquí GitHub actúa como el repositorio remoto donde se almacenará todo el historial de cambios del código fuente.</w:t>
       </w:r>
     </w:p>
     <w:p>
@@ -5398,23 +5234,7 @@
           <w:i/>
           <w:iCs/>
         </w:rPr>
-        <w:t xml:space="preserve">Figura 6. Autorización de Git </w:t>
-      </w:r>
-      <w:proofErr w:type="spellStart"/>
-      <w:r>
-        <w:rPr>
-          <w:i/>
-          <w:iCs/>
-        </w:rPr>
-        <w:t>Credential</w:t>
-      </w:r>
-      <w:proofErr w:type="spellEnd"/>
-      <w:r>
-        <w:rPr>
-          <w:i/>
-          <w:iCs/>
-        </w:rPr>
-        <w:t xml:space="preserve"> Manager.</w:t>
+        <w:t>Figura 6. Autorización de Git Credential Manager.</w:t>
       </w:r>
     </w:p>
     <w:p>
@@ -5424,63 +5244,7 @@
     </w:p>
     <w:p>
       <w:r>
-        <w:t>Una vez creado el repositorio, fue necesario vincular la cuenta de GitHub con el Git instalado en el equipo local para poder subir (</w:t>
-      </w:r>
-      <w:proofErr w:type="spellStart"/>
-      <w:r>
-        <w:t>push</w:t>
-      </w:r>
-      <w:proofErr w:type="spellEnd"/>
-      <w:r>
-        <w:t xml:space="preserve">) los archivos desde la terminal. La Figura 6 muestra la ventana de autorización de Git </w:t>
-      </w:r>
-      <w:proofErr w:type="spellStart"/>
-      <w:r>
-        <w:t>Credential</w:t>
-      </w:r>
-      <w:proofErr w:type="spellEnd"/>
-      <w:r>
-        <w:t xml:space="preserve"> Manager, una herramienta que gestiona de forma segura las credenciales de acceso a GitHub sin necesidad de escribir usuario y contraseña en cada operación. En esta pantalla se solicitan permisos específicos: acceso de lectura y escritura a </w:t>
-      </w:r>
-      <w:proofErr w:type="spellStart"/>
-      <w:r>
-        <w:t>Gists</w:t>
-      </w:r>
-      <w:proofErr w:type="spellEnd"/>
-      <w:r>
-        <w:t xml:space="preserve">, acceso a repositorios públicos y privados, y permiso para actualizar </w:t>
-      </w:r>
-      <w:proofErr w:type="spellStart"/>
-      <w:r>
-        <w:t>workflows</w:t>
-      </w:r>
-      <w:proofErr w:type="spellEnd"/>
-      <w:r>
-        <w:t xml:space="preserve"> de GitHub </w:t>
-      </w:r>
-      <w:proofErr w:type="spellStart"/>
-      <w:r>
-        <w:t>Actions</w:t>
-      </w:r>
-      <w:proofErr w:type="spellEnd"/>
-      <w:r>
-        <w:t>. Al aceptar ("</w:t>
-      </w:r>
-      <w:proofErr w:type="spellStart"/>
-      <w:r>
-        <w:t>Authorize</w:t>
-      </w:r>
-      <w:proofErr w:type="spellEnd"/>
-      <w:r>
-        <w:t xml:space="preserve"> </w:t>
-      </w:r>
-      <w:proofErr w:type="spellStart"/>
-      <w:r>
-        <w:t>git-ecosystem</w:t>
-      </w:r>
-      <w:proofErr w:type="spellEnd"/>
-      <w:r>
-        <w:t>"), el equipo local queda autenticado y habilitado para enviar y recibir información del repositorio remoto.</w:t>
+        <w:t>Una vez creado el repositorio, fue necesario vincular la cuenta de GitHub con el Git instalado en el equipo local para poder subir (push) los archivos desde la terminal. La Figura 6 muestra la ventana de autorización de Git Credential Manager, una herramienta que gestiona de forma segura las credenciales de acceso a GitHub sin necesidad de escribir usuario y contraseña en cada operación. En esta pantalla se solicitan permisos específicos: acceso de lectura y escritura a Gists, acceso a repositorios públicos y privados, y permiso para actualizar workflows de GitHub Actions. Al aceptar ("Authorize git-ecosystem"), el equipo local queda autenticado y habilitado para enviar y recibir información del repositorio remoto.</w:t>
       </w:r>
     </w:p>
     <w:p/>
@@ -5569,39 +5333,7 @@
         <w:t>La Figura 7</w:t>
       </w:r>
       <w:r>
-        <w:t xml:space="preserve"> confirma que el proceso de autenticación descrito en la Figura 6 se completó correctamente, mostrando el mensaje "</w:t>
-      </w:r>
-      <w:proofErr w:type="spellStart"/>
-      <w:r>
-        <w:t>Authentication</w:t>
-      </w:r>
-      <w:proofErr w:type="spellEnd"/>
-      <w:r>
-        <w:t xml:space="preserve"> </w:t>
-      </w:r>
-      <w:proofErr w:type="spellStart"/>
-      <w:r>
-        <w:t>Succeeded</w:t>
-      </w:r>
-      <w:proofErr w:type="spellEnd"/>
-      <w:r>
-        <w:t xml:space="preserve">". Esta confirmación indica que el navegador validó las credenciales ingresadas y devolvió el control a la terminal, permitiendo continuar con el flujo de trabajo de Git (por ejemplo, ejecutar comandos como </w:t>
-      </w:r>
-      <w:proofErr w:type="spellStart"/>
-      <w:r>
-        <w:t>git</w:t>
-      </w:r>
-      <w:proofErr w:type="spellEnd"/>
-      <w:r>
-        <w:t xml:space="preserve"> </w:t>
-      </w:r>
-      <w:proofErr w:type="spellStart"/>
-      <w:r>
-        <w:t>push</w:t>
-      </w:r>
-      <w:proofErr w:type="spellEnd"/>
-      <w:r>
-        <w:t>) sin que la sesión se interrumpa por errores de acceso.</w:t>
+        <w:t xml:space="preserve"> confirma que el proceso de autenticación descrito en la Figura 6 se completó correctamente, mostrando el mensaje "Authentication Succeeded". Esta confirmación indica que el navegador validó las credenciales ingresadas y devolvió el control a la terminal, permitiendo continuar con el flujo de trabajo de Git (por ejemplo, ejecutar comandos como git push) sin que la sesión se interrumpa por errores de acceso.</w:t>
       </w:r>
     </w:p>
     <w:p>
@@ -5622,11 +5354,159 @@
         <w:t>12. Resultados</w:t>
       </w:r>
     </w:p>
+    <w:p/>
+    <w:p>
+      <w:pPr>
+        <w:rPr>
+          <w:color w:val="2E74B5"/>
+          <w:sz w:val="26"/>
+          <w:szCs w:val="26"/>
+        </w:rPr>
+      </w:pPr>
+      <w:r>
+        <w:rPr>
+          <w:color w:val="2E74B5"/>
+          <w:sz w:val="26"/>
+          <w:szCs w:val="26"/>
+        </w:rPr>
+        <w:t>12.1.</w:t>
+      </w:r>
+      <w:r>
+        <w:rPr>
+          <w:color w:val="2E74B5"/>
+          <w:sz w:val="26"/>
+          <w:szCs w:val="26"/>
+        </w:rPr>
+        <w:t xml:space="preserve"> Vista final </w:t>
+      </w:r>
+      <w:r>
+        <w:rPr>
+          <w:color w:val="2E74B5"/>
+          <w:sz w:val="26"/>
+          <w:szCs w:val="26"/>
+        </w:rPr>
+        <w:t>del sistema con estudiantes registrados</w:t>
+      </w:r>
+    </w:p>
+    <w:p>
+      <w:pPr>
+        <w:jc w:val="center"/>
+        <w:rPr>
+          <w:color w:val="2E74B5"/>
+          <w:sz w:val="26"/>
+          <w:szCs w:val="26"/>
+        </w:rPr>
+      </w:pPr>
+      <w:r>
+        <w:rPr>
+          <w:color w:val="2E74B5"/>
+          <w:sz w:val="26"/>
+          <w:szCs w:val="26"/>
+        </w:rPr>
+        <w:drawing>
+          <wp:inline distT="0" distB="0" distL="0" distR="0" wp14:anchorId="45128EBB" wp14:editId="59F585D0">
+            <wp:extent cx="5186263" cy="6000750"/>
+            <wp:effectExtent l="0" t="0" r="0" b="0"/>
+            <wp:docPr id="2045737488" name="Imagen 1"/>
+            <wp:cNvGraphicFramePr>
+              <a:graphicFrameLocks xmlns:a="http://schemas.openxmlformats.org/drawingml/2006/main" noChangeAspect="1"/>
+            </wp:cNvGraphicFramePr>
+            <a:graphic xmlns:a="http://schemas.openxmlformats.org/drawingml/2006/main">
+              <a:graphicData uri="http://schemas.openxmlformats.org/drawingml/2006/picture">
+                <pic:pic xmlns:pic="http://schemas.openxmlformats.org/drawingml/2006/picture">
+                  <pic:nvPicPr>
+                    <pic:cNvPr id="2045737488" name=""/>
+                    <pic:cNvPicPr/>
+                  </pic:nvPicPr>
+                  <pic:blipFill>
+                    <a:blip r:embed="rId14"/>
+                    <a:stretch>
+                      <a:fillRect/>
+                    </a:stretch>
+                  </pic:blipFill>
+                  <pic:spPr>
+                    <a:xfrm>
+                      <a:off x="0" y="0"/>
+                      <a:ext cx="5209145" cy="6027226"/>
+                    </a:xfrm>
+                    <a:prstGeom prst="rect">
+                      <a:avLst/>
+                    </a:prstGeom>
+                  </pic:spPr>
+                </pic:pic>
+              </a:graphicData>
+            </a:graphic>
+          </wp:inline>
+        </w:drawing>
+      </w:r>
+    </w:p>
+    <w:p>
+      <w:pPr>
+        <w:jc w:val="center"/>
+        <w:rPr>
+          <w:i/>
+          <w:iCs/>
+        </w:rPr>
+      </w:pPr>
+      <w:r>
+        <w:rPr>
+          <w:i/>
+          <w:iCs/>
+        </w:rPr>
+        <w:t xml:space="preserve">Figura </w:t>
+      </w:r>
+      <w:r>
+        <w:rPr>
+          <w:i/>
+          <w:iCs/>
+        </w:rPr>
+        <w:t>8</w:t>
+      </w:r>
+      <w:r>
+        <w:rPr>
+          <w:i/>
+          <w:iCs/>
+        </w:rPr>
+        <w:t>. Vista final del sistema con estudiantes registrados y funciones de búsqueda, edición y eliminación.</w:t>
+      </w:r>
+    </w:p>
+    <w:p>
+      <w:pPr>
+        <w:jc w:val="center"/>
+        <w:rPr>
+          <w:i/>
+          <w:iCs/>
+        </w:rPr>
+      </w:pPr>
+    </w:p>
+    <w:p>
+      <w:r>
+        <w:t xml:space="preserve">La </w:t>
+      </w:r>
+      <w:r>
+        <w:rPr>
+          <w:b/>
+          <w:bCs/>
+        </w:rPr>
+        <w:t>Figura 1</w:t>
+      </w:r>
+      <w:r>
+        <w:rPr>
+          <w:b/>
+          <w:bCs/>
+        </w:rPr>
+        <w:t>8</w:t>
+      </w:r>
+      <w:r>
+        <w:t xml:space="preserve"> muestra la versión final de la interfaz del sistema, ya con dos estudiantes registrados (Eric Sanchez Valdivia y Lucia Gallo Perez). A diferencia de las capturas anteriores, en esta versión el formulario incorpora los campos Apellido Paterno y Apellido Materno de forma separada, así como un campo Carrera implementado como lista desplegable (select), lo que evita errores de digitación y estandariza la información ingresada. Además, se incluye un campo "Buscar estudiante...", que permite filtrar la lista en tiempo real, cumpliendo con el requerimiento RF02 (Buscar estudiante). Finalmente, la tabla "Lista de Estudiantes" incorpora en la columna Acciones los botones "Editar" y "Eliminar" para cada registro, evidenciando la implementación completa de los requerimientos RF03 (Editar estudiante) y RF04 (Eliminar estudiante). En conjunto, esta captura demuestra que el sistema cumple con la totalidad de los requerimientos funcionales definidos en la sección 6.1.</w:t>
+      </w:r>
+    </w:p>
     <w:p>
       <w:pPr>
         <w:pStyle w:val="Ttulo2"/>
       </w:pPr>
       <w:r>
+        <w:lastRenderedPageBreak/>
         <w:t>12.1. Evidencias del Repositorio</w:t>
       </w:r>
     </w:p>
@@ -5653,7 +5533,7 @@
                     </pic:cNvPicPr>
                   </pic:nvPicPr>
                   <pic:blipFill>
-                    <a:blip r:embed="rId14" cstate="print">
+                    <a:blip r:embed="rId15" cstate="print">
                       <a:extLst>
                         <a:ext uri="{28A0092B-C50C-407E-A947-70E740481C1C}">
                           <a14:useLocalDpi xmlns:a14="http://schemas.microsoft.com/office/drawing/2010/main" val="0"/>
@@ -5698,7 +5578,21 @@
           <w:i/>
           <w:iCs/>
         </w:rPr>
-        <w:t>Figura 8. Repositorio del proyecto publicado en GitHub.</w:t>
+        <w:t xml:space="preserve">Figura </w:t>
+      </w:r>
+      <w:r>
+        <w:rPr>
+          <w:i/>
+          <w:iCs/>
+        </w:rPr>
+        <w:t>9</w:t>
+      </w:r>
+      <w:r>
+        <w:rPr>
+          <w:i/>
+          <w:iCs/>
+        </w:rPr>
+        <w:t>. Repositorio del proyecto publicado en GitHub.</w:t>
       </w:r>
     </w:p>
     <w:p>
@@ -5712,66 +5606,17 @@
           <w:b/>
           <w:bCs/>
         </w:rPr>
-        <w:t>La Figura 8</w:t>
-      </w:r>
-      <w:r>
-        <w:t xml:space="preserve"> presenta la página principal del repositorio ya publicado en GitHub, bajo la ruta </w:t>
-      </w:r>
-      <w:proofErr w:type="spellStart"/>
-      <w:r>
-        <w:t>Erichjcb</w:t>
-      </w:r>
-      <w:proofErr w:type="spellEnd"/>
-      <w:r>
-        <w:t>/IESTP-</w:t>
-      </w:r>
-      <w:proofErr w:type="spellStart"/>
-      <w:r>
-        <w:t>Sistema_de_Registro_Estudiantes</w:t>
-      </w:r>
-      <w:proofErr w:type="spellEnd"/>
-      <w:r>
-        <w:t>. En ella se observa la carpeta del proyecto (CURSOS), el archivo README.md y la rama principal (</w:t>
-      </w:r>
-      <w:proofErr w:type="spellStart"/>
-      <w:r>
-        <w:t>main</w:t>
-      </w:r>
-      <w:proofErr w:type="spellEnd"/>
-      <w:r>
-        <w:t>) activa. El panel lateral "</w:t>
-      </w:r>
-      <w:proofErr w:type="spellStart"/>
-      <w:r>
-        <w:t>About</w:t>
-      </w:r>
-      <w:proofErr w:type="spellEnd"/>
-      <w:r>
-        <w:t xml:space="preserve">" indica que el repositorio es público, cuenta con 3 </w:t>
-      </w:r>
-      <w:proofErr w:type="spellStart"/>
-      <w:r>
-        <w:t>commits</w:t>
-      </w:r>
-      <w:proofErr w:type="spellEnd"/>
-      <w:r>
-        <w:t xml:space="preserve"> registrados y no presenta aún estrellas ni </w:t>
-      </w:r>
-      <w:proofErr w:type="spellStart"/>
-      <w:r>
-        <w:t>forks</w:t>
-      </w:r>
-      <w:proofErr w:type="spellEnd"/>
-      <w:r>
-        <w:t>, lo cual es esperado en un proyecto académico individual. Asimismo, el panel "</w:t>
-      </w:r>
-      <w:proofErr w:type="spellStart"/>
-      <w:r>
-        <w:t>Languages</w:t>
-      </w:r>
-      <w:proofErr w:type="spellEnd"/>
-      <w:r>
-        <w:t>" muestra la proporción de los lenguajes utilizados en el proyecto (CSS y HTML), lo que confirma que el sistema fue desarrollado íntegramente con tecnologías web del lado del cliente, tal como se planteó en los requerimientos no funcionales. Esta captura constituye la evidencia principal de que el proyecto fue publicado exitosamente y se encuentra disponible para su revisión en línea.</w:t>
+        <w:t xml:space="preserve">La Figura </w:t>
+      </w:r>
+      <w:r>
+        <w:rPr>
+          <w:b/>
+          <w:bCs/>
+        </w:rPr>
+        <w:t>9</w:t>
+      </w:r>
+      <w:r>
+        <w:t xml:space="preserve"> presenta la página principal del repositorio ya publicado en GitHub, bajo la ruta Erichjcb/IESTP-Sistema_de_Registro_Estudiantes. En ella se observa la carpeta del proyecto (CURSOS), el archivo README.md y la rama principal (main) activa. El panel lateral "About" indica que el repositorio es público, cuenta con 3 commits registrados y no presenta aún estrellas ni forks, lo cual es esperado en un proyecto académico individual. Asimismo, el panel "Languages" muestra la proporción de los lenguajes utilizados en el proyecto (CSS y HTML), lo que confirma que el sistema fue desarrollado íntegramente con tecnologías web del lado del cliente, tal como se planteó en los requerimientos no funcionales. Esta captura constituye la evidencia principal de que el proyecto fue publicado exitosamente y se encuentra disponible para su revisión en línea.</w:t>
       </w:r>
     </w:p>
     <w:p/>
@@ -5789,25 +5634,15 @@
           <w:sz w:val="26"/>
           <w:szCs w:val="26"/>
         </w:rPr>
-        <w:t xml:space="preserve">12.2. Evidencias de </w:t>
-      </w:r>
-      <w:proofErr w:type="spellStart"/>
-      <w:r>
-        <w:rPr>
-          <w:color w:val="2E74B5"/>
-          <w:sz w:val="26"/>
-          <w:szCs w:val="26"/>
-        </w:rPr>
-        <w:t>Commits</w:t>
-      </w:r>
-      <w:proofErr w:type="spellEnd"/>
+        <w:t>12.2. Evidencias de Commits</w:t>
+      </w:r>
     </w:p>
     <w:p>
       <w:r>
         <w:drawing>
-          <wp:inline distT="0" distB="0" distL="0" distR="0" wp14:anchorId="61DCC72E" wp14:editId="72559A82">
-            <wp:extent cx="5577840" cy="2809875"/>
-            <wp:effectExtent l="0" t="0" r="3810" b="9525"/>
+          <wp:inline distT="0" distB="0" distL="0" distR="0" wp14:anchorId="61DCC72E" wp14:editId="65F074CF">
+            <wp:extent cx="5577840" cy="3143250"/>
+            <wp:effectExtent l="0" t="0" r="3810" b="0"/>
             <wp:docPr id="1103295592" name="Imagen 20"/>
             <wp:cNvGraphicFramePr>
               <a:graphicFrameLocks xmlns:a="http://schemas.openxmlformats.org/drawingml/2006/main" noChangeAspect="1"/>
@@ -5822,7 +5657,7 @@
                     </pic:cNvPicPr>
                   </pic:nvPicPr>
                   <pic:blipFill>
-                    <a:blip r:embed="rId15" cstate="print">
+                    <a:blip r:embed="rId16" cstate="print">
                       <a:extLst>
                         <a:ext uri="{28A0092B-C50C-407E-A947-70E740481C1C}">
                           <a14:useLocalDpi xmlns:a14="http://schemas.microsoft.com/office/drawing/2010/main" val="0"/>
@@ -5837,7 +5672,7 @@
                   <pic:spPr bwMode="auto">
                     <a:xfrm>
                       <a:off x="0" y="0"/>
-                      <a:ext cx="5577840" cy="2809875"/>
+                      <a:ext cx="5577840" cy="3143250"/>
                     </a:xfrm>
                     <a:prstGeom prst="rect">
                       <a:avLst/>
@@ -5863,23 +5698,21 @@
           <w:i/>
           <w:iCs/>
         </w:rPr>
-        <w:t xml:space="preserve">Figura 9. Historial de </w:t>
-      </w:r>
-      <w:proofErr w:type="spellStart"/>
+        <w:t xml:space="preserve">Figura </w:t>
+      </w:r>
       <w:r>
         <w:rPr>
           <w:i/>
           <w:iCs/>
         </w:rPr>
-        <w:t>commits</w:t>
-      </w:r>
-      <w:proofErr w:type="spellEnd"/>
+        <w:t>10</w:t>
+      </w:r>
       <w:r>
         <w:rPr>
           <w:i/>
           <w:iCs/>
         </w:rPr>
-        <w:t xml:space="preserve"> en GitHub.</w:t>
+        <w:t>. Historial de commits en GitHub.</w:t>
       </w:r>
     </w:p>
     <w:p>
@@ -5889,74 +5722,17 @@
           <w:bCs/>
         </w:rPr>
         <w:lastRenderedPageBreak/>
-        <w:t>La Figura 9</w:t>
-      </w:r>
-      <w:r>
-        <w:t xml:space="preserve"> muestra el historial de </w:t>
-      </w:r>
-      <w:proofErr w:type="spellStart"/>
-      <w:r>
-        <w:t>commits</w:t>
-      </w:r>
-      <w:proofErr w:type="spellEnd"/>
-      <w:r>
-        <w:t xml:space="preserve"> del repositorio, visualizado desde la sección "</w:t>
-      </w:r>
-      <w:proofErr w:type="spellStart"/>
-      <w:r>
-        <w:t>Commits</w:t>
-      </w:r>
-      <w:proofErr w:type="spellEnd"/>
-      <w:r>
-        <w:t xml:space="preserve">" de GitHub. Se registran tres </w:t>
-      </w:r>
-      <w:proofErr w:type="spellStart"/>
-      <w:r>
-        <w:t>commits</w:t>
-      </w:r>
-      <w:proofErr w:type="spellEnd"/>
-      <w:r>
-        <w:t xml:space="preserve"> realizados sobre la rama </w:t>
-      </w:r>
-      <w:proofErr w:type="spellStart"/>
-      <w:r>
-        <w:t>main</w:t>
-      </w:r>
-      <w:proofErr w:type="spellEnd"/>
-      <w:r>
-        <w:t xml:space="preserve">: "Inicio del proyecto", el primer </w:t>
-      </w:r>
-      <w:proofErr w:type="spellStart"/>
-      <w:r>
-        <w:t>commit</w:t>
-      </w:r>
-      <w:proofErr w:type="spellEnd"/>
-      <w:r>
-        <w:t xml:space="preserve"> que estableció la base del repositorio; "Primer </w:t>
-      </w:r>
-      <w:proofErr w:type="spellStart"/>
-      <w:r>
-        <w:t>commit</w:t>
-      </w:r>
-      <w:proofErr w:type="spellEnd"/>
-      <w:r>
-        <w:t xml:space="preserve">", correspondiente a un avance posterior; y "Diseño de la interfaz con CSS", que documenta específicamente el trabajo de estilizado de la aplicación. Cada entrada incluye el identificador corto del </w:t>
-      </w:r>
-      <w:proofErr w:type="spellStart"/>
-      <w:r>
-        <w:t>commit</w:t>
-      </w:r>
-      <w:proofErr w:type="spellEnd"/>
-      <w:r>
-        <w:t xml:space="preserve"> (hash), el autor (</w:t>
-      </w:r>
-      <w:proofErr w:type="spellStart"/>
-      <w:r>
-        <w:t>Erichjcb</w:t>
-      </w:r>
-      <w:proofErr w:type="spellEnd"/>
-      <w:r>
-        <w:t>) y el tiempo transcurrido desde su creación. Este historial evidencia que el desarrollo del sistema se realizó de manera incremental y ordenada, dejando trazabilidad de cada etapa del proyecto.</w:t>
+        <w:t xml:space="preserve">La Figura </w:t>
+      </w:r>
+      <w:r>
+        <w:rPr>
+          <w:b/>
+          <w:bCs/>
+        </w:rPr>
+        <w:t>10</w:t>
+      </w:r>
+      <w:r>
+        <w:t xml:space="preserve"> muestra el historial de commits del repositorio, visualizado desde la sección "Commits" de GitHub. Se registran tres commits realizados sobre la rama main: "Inicio del proyecto", el primer commit que estableció la base del repositorio; "Primer commit", correspondiente a un avance posterior; y "Diseño de la interfaz con CSS", que documenta específicamente el trabajo de estilizado de la aplicación. Cada entrada incluye el identificador corto del commit (hash), el autor (Erichjcb) y el tiempo transcurrido desde su creación. Este historial evidencia que el desarrollo del sistema se realizó de manera incremental y ordenada, dejando trazabilidad de cada etapa del proyecto.</w:t>
       </w:r>
     </w:p>
     <w:p/>
@@ -5980,7 +5756,7 @@
                     </pic:cNvPicPr>
                   </pic:nvPicPr>
                   <pic:blipFill>
-                    <a:blip r:embed="rId16" cstate="print">
+                    <a:blip r:embed="rId17" cstate="print">
                       <a:extLst>
                         <a:ext uri="{28A0092B-C50C-407E-A947-70E740481C1C}">
                           <a14:useLocalDpi xmlns:a14="http://schemas.microsoft.com/office/drawing/2010/main" val="0"/>
@@ -6027,30 +5803,23 @@
           <w:i/>
           <w:iCs/>
         </w:rPr>
-        <w:t>Figura 10</w:t>
-      </w:r>
-      <w:r>
-        <w:rPr>
+        <w:t>Figura 1</w:t>
+      </w:r>
+      <w:r>
+        <w:rPr>
+          <w:b/>
+          <w:bCs/>
           <w:i/>
           <w:iCs/>
         </w:rPr>
-        <w:t xml:space="preserve">. Registro de </w:t>
-      </w:r>
-      <w:proofErr w:type="spellStart"/>
+        <w:t>1</w:t>
+      </w:r>
       <w:r>
         <w:rPr>
           <w:i/>
           <w:iCs/>
         </w:rPr>
-        <w:t>commit</w:t>
-      </w:r>
-      <w:proofErr w:type="spellEnd"/>
-      <w:r>
-        <w:rPr>
-          <w:i/>
-          <w:iCs/>
-        </w:rPr>
-        <w:t xml:space="preserve"> "Inicio del proyecto" desde la terminal.</w:t>
+        <w:t>. Registro de commit "Inicio del proyecto" desde la terminal.</w:t>
       </w:r>
     </w:p>
     <w:p/>
@@ -6060,95 +5829,24 @@
           <w:b/>
           <w:bCs/>
         </w:rPr>
-        <w:t xml:space="preserve">La Figura 10 </w:t>
-      </w:r>
-      <w:r>
-        <w:t xml:space="preserve">muestra la salida de la terminal (Git Bash) al ejecutar el comando </w:t>
-      </w:r>
-      <w:proofErr w:type="spellStart"/>
-      <w:r>
-        <w:t>git</w:t>
-      </w:r>
-      <w:proofErr w:type="spellEnd"/>
-      <w:r>
+        <w:t>La Figura 1</w:t>
+      </w:r>
+      <w:r>
+        <w:rPr>
+          <w:b/>
+          <w:bCs/>
+        </w:rPr>
+        <w:t>1</w:t>
+      </w:r>
+      <w:r>
+        <w:rPr>
+          <w:b/>
+          <w:bCs/>
+        </w:rPr>
         <w:t xml:space="preserve"> </w:t>
       </w:r>
-      <w:proofErr w:type="spellStart"/>
-      <w:r>
-        <w:t>commit</w:t>
-      </w:r>
-      <w:proofErr w:type="spellEnd"/>
-      <w:r>
-        <w:t xml:space="preserve"> -m "Inicio del proyecto". El mensaje de confirmación [</w:t>
-      </w:r>
-      <w:proofErr w:type="gramStart"/>
-      <w:r>
-        <w:t>master</w:t>
-      </w:r>
-      <w:proofErr w:type="gramEnd"/>
-      <w:r>
-        <w:t xml:space="preserve"> (</w:t>
-      </w:r>
-      <w:proofErr w:type="spellStart"/>
-      <w:r>
-        <w:t>root-commit</w:t>
-      </w:r>
-      <w:proofErr w:type="spellEnd"/>
-      <w:r>
-        <w:t xml:space="preserve">) baa5859] Inicio del proyecto indica que se trata del primer </w:t>
-      </w:r>
-      <w:proofErr w:type="spellStart"/>
-      <w:r>
-        <w:t>commit</w:t>
-      </w:r>
-      <w:proofErr w:type="spellEnd"/>
-      <w:r>
-        <w:t xml:space="preserve"> del repositorio (</w:t>
-      </w:r>
-      <w:proofErr w:type="spellStart"/>
-      <w:r>
-        <w:t>root-commit</w:t>
-      </w:r>
-      <w:proofErr w:type="spellEnd"/>
-      <w:r>
-        <w:t xml:space="preserve">), identificado con el hash baa5859. La terminal detalla además la cantidad de archivos incorporados en este </w:t>
-      </w:r>
-      <w:proofErr w:type="spellStart"/>
-      <w:r>
-        <w:t>commit</w:t>
-      </w:r>
-      <w:proofErr w:type="spellEnd"/>
-      <w:r>
-        <w:t xml:space="preserve"> inicial (126 files </w:t>
-      </w:r>
-      <w:proofErr w:type="spellStart"/>
-      <w:r>
-        <w:t>changed</w:t>
-      </w:r>
-      <w:proofErr w:type="spellEnd"/>
-      <w:r>
-        <w:t xml:space="preserve">, 1882 </w:t>
-      </w:r>
-      <w:proofErr w:type="spellStart"/>
-      <w:proofErr w:type="gramStart"/>
-      <w:r>
-        <w:t>insertions</w:t>
-      </w:r>
-      <w:proofErr w:type="spellEnd"/>
-      <w:r>
-        <w:t>(</w:t>
-      </w:r>
-      <w:proofErr w:type="gramEnd"/>
-      <w:r>
-        <w:t xml:space="preserve">+)), listando cada uno de los archivos añadidos al control de versiones. Esta captura respalda, a nivel de terminal, el mismo </w:t>
-      </w:r>
-      <w:proofErr w:type="spellStart"/>
-      <w:r>
-        <w:t>commit</w:t>
-      </w:r>
-      <w:proofErr w:type="spellEnd"/>
-      <w:r>
-        <w:t xml:space="preserve"> que se observa reflejado posteriormente en GitHub (Figura 9), confirmando que el flujo local-remoto funcionó correctamente.</w:t>
+      <w:r>
+        <w:t>muestra la salida de la terminal (Git Bash) al ejecutar el comando git commit -m "Inicio del proyecto". El mensaje de confirmación [master (root-commit) baa5859] Inicio del proyecto indica que se trata del primer commit del repositorio (root-commit), identificado con el hash baa5859. La terminal detalla además la cantidad de archivos incorporados en este commit inicial (126 files changed, 1882 insertions(+)), listando cada uno de los archivos añadidos al control de versiones. Esta captura respalda, a nivel de terminal, el mismo commit que se observa reflejado posteriormente en GitHub (Figura 9), confirmando que el flujo local-remoto funcionó correctamente.</w:t>
       </w:r>
     </w:p>
     <w:p/>
@@ -6211,15 +5909,7 @@
         <w:spacing w:after="80"/>
       </w:pPr>
       <w:r>
-        <w:t xml:space="preserve">El uso de </w:t>
-      </w:r>
-      <w:proofErr w:type="spellStart"/>
-      <w:r>
-        <w:t>LocalStorage</w:t>
-      </w:r>
-      <w:proofErr w:type="spellEnd"/>
-      <w:r>
-        <w:t xml:space="preserve"> resultó adecuado para un sistema de alcance académico, ya que garantiza la persistencia de los datos sin necesidad de un servidor o base de datos externa.</w:t>
+        <w:t>El uso de LocalStorage resultó adecuado para un sistema de alcance académico, ya que garantiza la persistencia de los datos sin necesidad de un servidor o base de datos externa.</w:t>
       </w:r>
     </w:p>
     <w:p>
@@ -6232,15 +5922,7 @@
         <w:spacing w:after="80"/>
       </w:pPr>
       <w:r>
-        <w:t xml:space="preserve">La gestión del proyecto mediante Git y GitHub permitió llevar un control de versiones ordenado, registrar el avance del desarrollo mediante </w:t>
-      </w:r>
-      <w:proofErr w:type="spellStart"/>
-      <w:r>
-        <w:t>commits</w:t>
-      </w:r>
-      <w:proofErr w:type="spellEnd"/>
-      <w:r>
-        <w:t xml:space="preserve"> y publicar el proyecto de forma pública y accesible.</w:t>
+        <w:t>La gestión del proyecto mediante Git y GitHub permitió llevar un control de versiones ordenado, registrar el avance del desarrollo mediante commits y publicar el proyecto de forma pública y accesible.</w:t>
       </w:r>
     </w:p>
     <w:p>
@@ -6279,15 +5961,7 @@
         <w:spacing w:after="80"/>
       </w:pPr>
       <w:r>
-        <w:t xml:space="preserve">Migrar el almacenamiento de </w:t>
-      </w:r>
-      <w:proofErr w:type="spellStart"/>
-      <w:r>
-        <w:t>LocalStorage</w:t>
-      </w:r>
-      <w:proofErr w:type="spellEnd"/>
-      <w:r>
-        <w:t xml:space="preserve"> a una base de datos real (por ejemplo, MySQL) si el sistema requiriera escalar a múltiples usuarios o equipos.</w:t>
+        <w:t>Migrar el almacenamiento de LocalStorage a una base de datos real (por ejemplo, MySQL) si el sistema requiriera escalar a múltiples usuarios o equipos.</w:t>
       </w:r>
     </w:p>
     <w:p>
@@ -6326,15 +6000,7 @@
         <w:spacing w:after="80"/>
       </w:pPr>
       <w:r>
-        <w:t>Continuar utilizando Git y GitHub en proyectos futuros, aplicando buenas prácticas como el uso de ramas (</w:t>
-      </w:r>
-      <w:proofErr w:type="spellStart"/>
-      <w:r>
-        <w:t>branches</w:t>
-      </w:r>
-      <w:proofErr w:type="spellEnd"/>
-      <w:r>
-        <w:t>) para nuevas funcionalidades.</w:t>
+        <w:t>Continuar utilizando Git y GitHub en proyectos futuros, aplicando buenas prácticas como el uso de ramas (branches) para nuevas funcionalidades.</w:t>
       </w:r>
     </w:p>
     <w:p>
@@ -6396,37 +6062,8 @@
           <w:numId w:val="4"/>
         </w:numPr>
       </w:pPr>
-      <w:proofErr w:type="spellStart"/>
-      <w:r>
-        <w:t>Object</w:t>
-      </w:r>
-      <w:proofErr w:type="spellEnd"/>
-      <w:r>
-        <w:t xml:space="preserve"> Management Group. (s.f.). Especificación del lenguaje UML (</w:t>
-      </w:r>
-      <w:proofErr w:type="spellStart"/>
-      <w:r>
-        <w:t>Unified</w:t>
-      </w:r>
-      <w:proofErr w:type="spellEnd"/>
-      <w:r>
-        <w:t xml:space="preserve"> </w:t>
-      </w:r>
-      <w:proofErr w:type="spellStart"/>
-      <w:r>
-        <w:t>Modeling</w:t>
-      </w:r>
-      <w:proofErr w:type="spellEnd"/>
-      <w:r>
-        <w:t xml:space="preserve"> </w:t>
-      </w:r>
-      <w:proofErr w:type="spellStart"/>
-      <w:r>
-        <w:t>Language</w:t>
-      </w:r>
-      <w:proofErr w:type="spellEnd"/>
-      <w:r>
-        <w:t>). https://www.omg.org/spec/UML/</w:t>
+      <w:r>
+        <w:t>Object Management Group. (s.f.). Especificación del lenguaje UML (Unified Modeling Language). https://www.omg.org/spec/UML/</w:t>
       </w:r>
     </w:p>
     <w:p>
@@ -6440,7 +6077,7 @@
       <w:r>
         <w:t xml:space="preserve">W3Schools. (s.f.). Referencia de HTML, CSS, JavaScript y Web Storage API. </w:t>
       </w:r>
-      <w:hyperlink r:id="rId17" w:history="1">
+      <w:hyperlink r:id="rId18" w:history="1">
         <w:r>
           <w:rPr>
             <w:rStyle w:val="Hipervnculo"/>
@@ -6468,15 +6105,7 @@
         <w:spacing w:after="160"/>
       </w:pPr>
       <w:r>
-        <w:t xml:space="preserve">Se adjunta el enlace del repositorio del proyecto en GitHub, donde se encuentra disponible el código fuente completo (index.html, style.css y script.js), el historial de </w:t>
-      </w:r>
-      <w:proofErr w:type="spellStart"/>
-      <w:r>
-        <w:t>commits</w:t>
-      </w:r>
-      <w:proofErr w:type="spellEnd"/>
-      <w:r>
-        <w:t xml:space="preserve"> y el archivo README del proyecto:</w:t>
+        <w:t>Se adjunta el enlace del repositorio del proyecto en GitHub, donde se encuentra disponible el código fuente completo (index.html, style.css y script.js), el historial de commits y el archivo README del proyecto:</w:t>
       </w:r>
     </w:p>
     <w:p>

</xml_diff>